<commit_message>
Multiple changes to layout and fading content
</commit_message>
<xml_diff>
--- a/_site/assets/docs/Derek-Best-Resume.docx
+++ b/_site/assets/docs/Derek-Best-Resume.docx
@@ -96,7 +96,7 @@
           <w:rFonts w:ascii="Calibri" w:cs="Calibri" w:eastAsia="Calibri" w:hAnsi="Calibri"/>
           <w:rtl w:val="0"/>
         </w:rPr>
-        <w:t xml:space="preserve">Creative and tech-savvy Senior Web &amp; UI/UX Designer with 15+ years of success crafting Section 508 compliant, visually appealing, and user-friendly websites. Passionate in the Frontend development of responsive designs which improve the user interface (UI)/user experience (UX) providing a seamless digital experience. Developed 100+ websites for federal government, federal healthcare, national energy, and defense agencies. Leverages communication and organizational skills to thrive in collaborative settings.</w:t>
+        <w:t xml:space="preserve">Creative and tech-savvy Senior Web &amp; UI/UX Designer with 15+ years of success crafting Section 508 compliant, visually appealing, and user-friendly websites. Passionate in the Frontend development of responsive designs which improve the user interface (UI)/user experience (UX) providing a seamless digital experience. Developed 100+ websites for federal government, federal healthcare, national energy, and defense agencies, utilizing HTML, Coldfusion and PHP.  Leverages communication and organizational skills to thrive in collaborative settings.</w:t>
       </w:r>
     </w:p>
     <w:p>
@@ -169,7 +169,7 @@
           <w:rFonts w:ascii="Calibri" w:cs="Calibri" w:eastAsia="Calibri" w:hAnsi="Calibri"/>
           <w:rtl w:val="0"/>
         </w:rPr>
-        <w:t xml:space="preserve">HTML5, CSS3, PHP, Basic Scripting in JavaScript (Dom Manipulation &amp; jQuery), XML, Adobe (Photoshop, Illustrator, XD, Dreamweaver, Premier), Axure RP, Sharepoint, Lunacy (Sketch), WordPress, Angular, VS Code, API, Siteimprove, Agile, Scrum, DevOps, Git, Balsamic, Confluence, ColdFusion, Perl/CGI, Mura Content Management System, Artificial Intelligence (AI) (ChatGPT/Bard)  </w:t>
+        <w:t xml:space="preserve">HTML5, CSS3, PHP, Basic Scripting in JavaScript (Dom Manipulation &amp; jQuery), YAML, XML, Adobe (Photoshop, Illustrator, XD, Dreamweaver, Premier), Axure RP, Sharepoint, Lunacy (Sketch), WordPress, Angular, VS Code, API, Siteimprove, Agile, Scrum, DevOps, Git, Balsamic, Confluence, ColdFusion, Perl/CGI, Mura Content Management System, Artificial Intelligence (AI) (ChatGPT/Bard)  </w:t>
       </w:r>
     </w:p>
     <w:p>
@@ -331,7 +331,7 @@
           <w:rFonts w:ascii="Calibri" w:cs="Calibri" w:eastAsia="Calibri" w:hAnsi="Calibri"/>
           <w:rtl w:val="0"/>
         </w:rPr>
-        <w:t xml:space="preserve"> | June 2025 - Present</w:t>
+        <w:t xml:space="preserve"> | June 2025 - May 2026</w:t>
       </w:r>
     </w:p>
     <w:p>
@@ -892,21 +892,43 @@
       <w:r>
         <w:rPr>
           <w:rFonts w:ascii="Calibri" w:cs="Calibri" w:eastAsia="Calibri" w:hAnsi="Calibri"/>
-          <w:b w:val="0"/>
-          <w:bCs w:val="0"/>
-          <w:i w:val="0"/>
-          <w:iCs w:val="0"/>
-          <w:smallCaps w:val="0"/>
-          <w:strike w:val="0"/>
-          <w:color w:val="000000"/>
-          <w:sz w:val="22"/>
-          <w:szCs w:val="22"/>
+          <w:rtl w:val="0"/>
+        </w:rPr>
+        <w:t xml:space="preserve">Architected WordPress decoupled architectures for internal sites and custom PHP templates utilizing advanced JavaScript interactions and optimized CSS structures to maximize site speed and user experience metrics</w:t>
+      </w:r>
+    </w:p>
+    <w:p>
+      <w:pPr>
+        <w:keepNext w:val="0"/>
+        <w:keepLines w:val="0"/>
+        <w:pageBreakBefore w:val="0"/>
+        <w:widowControl w:val="1"/>
+        <w:numPr>
+          <w:ilvl w:val="0"/>
+          <w:numId w:val="3"/>
+        </w:numPr>
+        <w:pBdr>
+          <w:top w:space="0" w:sz="0" w:val="nil"/>
+          <w:left w:space="0" w:sz="0" w:val="nil"/>
+          <w:bottom w:space="0" w:sz="0" w:val="nil"/>
+          <w:right w:space="0" w:sz="0" w:val="nil"/>
+          <w:between w:space="0" w:sz="0" w:val="nil"/>
+        </w:pBdr>
+        <w:shd w:fill="auto" w:val="clear"/>
+        <w:spacing w:after="0" w:before="0" w:line="259" w:lineRule="auto"/>
+        <w:ind w:left="1332" w:right="0" w:hanging="360"/>
+        <w:jc w:val="left"/>
+        <w:rPr>
+          <w:rFonts w:ascii="Calibri" w:cs="Calibri" w:eastAsia="Calibri" w:hAnsi="Calibri"/>
           <w:u w:val="none"/>
-          <w:shd w:fill="auto" w:val="clear"/>
-          <w:vertAlign w:val="baseline"/>
-          <w:rtl w:val="0"/>
-        </w:rPr>
-        <w:t xml:space="preserve">Designed and developed internal Lab Operating system website</w:t>
+        </w:rPr>
+      </w:pPr>
+      <w:r>
+        <w:rPr>
+          <w:rFonts w:ascii="Calibri" w:cs="Calibri" w:eastAsia="Calibri" w:hAnsi="Calibri"/>
+          <w:rtl w:val="0"/>
+        </w:rPr>
+        <w:t xml:space="preserve">Designed custom WordPress dashboards and flexible content workflows that empowered non-technical stakeholders to effortlessly publish and manage secure web updates</w:t>
       </w:r>
     </w:p>
     <w:p>
@@ -987,19 +1009,6 @@
         <w:spacing w:after="0" w:lineRule="auto"/>
         <w:rPr>
           <w:rFonts w:ascii="Calibri" w:cs="Calibri" w:eastAsia="Calibri" w:hAnsi="Calibri"/>
-        </w:rPr>
-      </w:pPr>
-      <w:r>
-        <w:rPr>
-          <w:rtl w:val="0"/>
-        </w:rPr>
-      </w:r>
-    </w:p>
-    <w:p>
-      <w:pPr>
-        <w:spacing w:after="0" w:lineRule="auto"/>
-        <w:rPr>
-          <w:rFonts w:ascii="Calibri" w:cs="Calibri" w:eastAsia="Calibri" w:hAnsi="Calibri"/>
           <w:i w:val="1"/>
           <w:iCs w:val="1"/>
         </w:rPr>
@@ -1132,7 +1141,7 @@
           <w:rFonts w:ascii="Calibri" w:cs="Calibri" w:eastAsia="Calibri" w:hAnsi="Calibri"/>
           <w:rtl w:val="0"/>
         </w:rPr>
-        <w:t xml:space="preserve">Created mockups, wireframes, graphics, and final templates using HTML4-5, ColdFusion, CSS2-3, and jQuery and which were integrated utilizing the Mura Content Management System</w:t>
+        <w:t xml:space="preserve">Created mockups, wireframes, graphics, and final templates using HTML4-5, ColdFusion, CSS2-3, and jQuery and which were integrated utilizing the Mura Coldfusion-based CMS</w:t>
       </w:r>
     </w:p>
     <w:p>
@@ -1311,19 +1320,6 @@
           <w:rtl w:val="0"/>
         </w:rPr>
         <w:t xml:space="preserve">University of Utah</w:t>
-      </w:r>
-    </w:p>
-    <w:p>
-      <w:pPr>
-        <w:spacing w:after="0" w:lineRule="auto"/>
-        <w:rPr>
-          <w:rFonts w:ascii="Calibri" w:cs="Calibri" w:eastAsia="Calibri" w:hAnsi="Calibri"/>
-        </w:rPr>
-      </w:pPr>
-      <w:r>
-        <w:rPr>
-          <w:rtl w:val="0"/>
-        </w:rPr>
       </w:r>
     </w:p>
     <w:p>

</xml_diff>